<commit_message>
docs(manual): publicar manual de usuario 1.1 y regenerar capturas de la wiki
- manual.docx editado sobre el original (mismo formato) y manual.pdf
  regenerado: venta de contado o por cobrar, registro de pago (nueva 5.4),
  Sobre nosotros (nueva 2.4), cancelación de facturas Pendiente, precio
  guardado en cada factura, reportes renombrados y sin canceladas, fecha de
  registro no futura y glosario/referencias al SRS 1.5.
- 15 capturas renovadas y 3 nuevas; la Figura 13 repetía la imagen de la 12
  y ahora tiene la suya. Índice recalculado: el original estaba desfasado
  desde la sección 4 (decía 11 donde era 15, 23 donde era 35).
- Las 51 capturas de la wiki se regeneraron con capturas.mjs; el paso de
  selección de cliente ahora señala también la forma de pago.
- README, RELEASE y novedades sin avisos de manual pendiente.
</commit_message>
<xml_diff>
--- a/referencias/manual.docx
+++ b/referencias/manual.docx
@@ -344,7 +344,7 @@
         <w:rPr>
           <w:lang w:val="es-ES"/>
         </w:rPr>
-        <w:t>27 de octubre de 2026</w:t>
+        <w:t xml:space="preserve">30 de octubre de 2026</w:t>
       </w:r>
     </w:p>
     <w:p>
@@ -392,8 +392,8 @@
       <w:tblGrid>
         <w:gridCol w:w="1152"/>
         <w:gridCol w:w="1584"/>
-        <w:gridCol w:w="1440"/>
-        <w:gridCol w:w="5184"/>
+        <w:gridCol w:w="1700"/>
+        <w:gridCol w:w="4924"/>
       </w:tblGrid>
       <w:tr>
         <w:trPr>
@@ -452,7 +452,7 @@
         </w:tc>
         <w:tc>
           <w:tcPr>
-            <w:tcW w:w="1440" w:type="dxa"/>
+            <w:tcW w:w="1700" w:type="dxa"/>
             <w:tcMar>
               <w:top w:w="90" w:type="dxa"/>
               <w:left w:w="100" w:type="dxa"/>
@@ -477,7 +477,7 @@
         </w:tc>
         <w:tc>
           <w:tcPr>
-            <w:tcW w:w="5184" w:type="dxa"/>
+            <w:tcW w:w="4924" w:type="dxa"/>
             <w:tcMar>
               <w:top w:w="90" w:type="dxa"/>
               <w:left w:w="100" w:type="dxa"/>
@@ -555,7 +555,7 @@
         </w:tc>
         <w:tc>
           <w:tcPr>
-            <w:tcW w:w="1440" w:type="dxa"/>
+            <w:tcW w:w="1700" w:type="dxa"/>
             <w:tcMar>
               <w:top w:w="90" w:type="dxa"/>
               <w:left w:w="100" w:type="dxa"/>
@@ -573,13 +573,13 @@
               <w:rPr>
                 <w:rFonts w:eastAsia="Arial" w:cs="Arial"/>
               </w:rPr>
-              <w:t>Vigente</w:t>
+              <w:t xml:space="preserve">Reemplazada</w:t>
             </w:r>
           </w:p>
         </w:tc>
         <w:tc>
           <w:tcPr>
-            <w:tcW w:w="5184" w:type="dxa"/>
+            <w:tcW w:w="4924" w:type="dxa"/>
             <w:tcMar>
               <w:top w:w="90" w:type="dxa"/>
               <w:left w:w="100" w:type="dxa"/>
@@ -606,6 +606,111 @@
           </w:p>
         </w:tc>
       </w:tr>
+      <w:tr>
+        <w:trPr>
+          <w:cantSplit/>
+        </w:trPr>
+        <w:tc>
+          <w:tcPr>
+            <w:tcW w:w="1152" w:type="dxa"/>
+            <w:tcMar>
+              <w:top w:w="90" w:type="dxa"/>
+              <w:left w:w="100" w:type="dxa"/>
+              <w:bottom w:w="90" w:type="dxa"/>
+              <w:right w:w="100" w:type="dxa"/>
+            </w:tcMar>
+            <w:vAlign w:val="center"/>
+          </w:tcPr>
+          <w:p>
+            <w:pPr>
+              <w:spacing w:line="360" w:lineRule="auto"/>
+              <w:ind w:firstLine="0"/>
+            </w:pPr>
+            <w:r>
+              <w:rPr>
+                <w:rFonts w:eastAsia="Arial" w:cs="Arial"/>
+              </w:rPr>
+              <w:t xml:space="preserve">1.1</w:t>
+            </w:r>
+          </w:p>
+        </w:tc>
+        <w:tc>
+          <w:tcPr>
+            <w:tcW w:w="1584" w:type="dxa"/>
+            <w:tcMar>
+              <w:top w:w="90" w:type="dxa"/>
+              <w:left w:w="100" w:type="dxa"/>
+              <w:bottom w:w="90" w:type="dxa"/>
+              <w:right w:w="100" w:type="dxa"/>
+            </w:tcMar>
+            <w:vAlign w:val="center"/>
+          </w:tcPr>
+          <w:p>
+            <w:pPr>
+              <w:spacing w:line="360" w:lineRule="auto"/>
+              <w:ind w:firstLine="0"/>
+            </w:pPr>
+            <w:r>
+              <w:rPr>
+                <w:rFonts w:eastAsia="Arial" w:cs="Arial"/>
+              </w:rPr>
+              <w:t xml:space="preserve">30/10/2026</w:t>
+            </w:r>
+          </w:p>
+        </w:tc>
+        <w:tc>
+          <w:tcPr>
+            <w:tcW w:w="1700" w:type="dxa"/>
+            <w:tcMar>
+              <w:top w:w="90" w:type="dxa"/>
+              <w:left w:w="100" w:type="dxa"/>
+              <w:bottom w:w="90" w:type="dxa"/>
+              <w:right w:w="100" w:type="dxa"/>
+            </w:tcMar>
+            <w:vAlign w:val="center"/>
+          </w:tcPr>
+          <w:p>
+            <w:pPr>
+              <w:spacing w:line="360" w:lineRule="auto"/>
+              <w:ind w:firstLine="0"/>
+            </w:pPr>
+            <w:r>
+              <w:rPr>
+                <w:rFonts w:eastAsia="Arial" w:cs="Arial"/>
+              </w:rPr>
+              <w:t xml:space="preserve">Vigente</w:t>
+            </w:r>
+          </w:p>
+        </w:tc>
+        <w:tc>
+          <w:tcPr>
+            <w:tcW w:w="4924" w:type="dxa"/>
+            <w:tcMar>
+              <w:top w:w="90" w:type="dxa"/>
+              <w:left w:w="100" w:type="dxa"/>
+              <w:bottom w:w="90" w:type="dxa"/>
+              <w:right w:w="100" w:type="dxa"/>
+            </w:tcMar>
+            <w:vAlign w:val="center"/>
+          </w:tcPr>
+          <w:p>
+            <w:pPr>
+              <w:spacing w:line="360" w:lineRule="auto"/>
+              <w:ind w:firstLine="0"/>
+              <w:rPr>
+                <w:lang w:val="es-ES"/>
+              </w:rPr>
+            </w:pPr>
+            <w:r>
+              <w:rPr>
+                <w:rFonts w:eastAsia="Arial" w:cs="Arial"/>
+                <w:lang w:val="es-ES"/>
+              </w:rPr>
+              <w:t xml:space="preserve">Actualización al SRS 1.5: ventas de contado o por cobrar, registro de pago (5.4), precio guardado en cada factura, reportes de ventas sin facturas canceladas, fecha de registro no posterior a hoy y ayuda en Sobre nosotros (2.4). Se renuevan las capturas, se corrige la Figura 13 y se recalcula el índice.</w:t>
+            </w:r>
+          </w:p>
+        </w:tc>
+      </w:tr>
     </w:tbl>
     <w:p>
       <w:pPr>
@@ -624,7 +729,7 @@
         <w:rPr>
           <w:lang w:val="es-ES"/>
         </w:rPr>
-        <w:t>Este manual corresponde a la versión del aplicativo revisada para el proyecto y describe las funciones disponibles en sus módulos de clientes, productos, facturas y reportes. La interfaz o las reglas pueden cambiar en versiones posteriores.</w:t>
+        <w:t xml:space="preserve">Este manual corresponde a la versión del aplicativo descrita en el SRS 1.5 y explica las funciones disponibles en sus módulos de clientes, productos, facturas, reportes y Sobre nosotros. La interfaz o las reglas pueden cambiar en versiones posteriores.</w:t>
       </w:r>
     </w:p>
     <w:p>
@@ -658,11 +763,6 @@
           <w:lang w:val="es-ES"/>
         </w:rPr>
         <w:t>Control del documento</w:t>
-      </w:r>
-      <w:r>
-        <w:rPr>
-          <w:lang w:val="es-ES"/>
-        </w:rPr>
         <w:tab/>
         <w:t>2</w:t>
       </w:r>
@@ -682,11 +782,6 @@
           <w:lang w:val="es-ES"/>
         </w:rPr>
         <w:t>Resumen ejecutivo</w:t>
-      </w:r>
-      <w:r>
-        <w:rPr>
-          <w:lang w:val="es-ES"/>
-        </w:rPr>
         <w:tab/>
         <w:t>5</w:t>
       </w:r>
@@ -706,11 +801,6 @@
           <w:lang w:val="es-ES"/>
         </w:rPr>
         <w:t>1 Introducción</w:t>
-      </w:r>
-      <w:r>
-        <w:rPr>
-          <w:lang w:val="es-ES"/>
-        </w:rPr>
         <w:tab/>
         <w:t>6</w:t>
       </w:r>
@@ -730,11 +820,6 @@
           <w:lang w:val="es-ES"/>
         </w:rPr>
         <w:t>1.1 Propósito y destinatarios</w:t>
-      </w:r>
-      <w:r>
-        <w:rPr>
-          <w:lang w:val="es-ES"/>
-        </w:rPr>
         <w:tab/>
         <w:t>6</w:t>
       </w:r>
@@ -754,11 +839,6 @@
           <w:lang w:val="es-ES"/>
         </w:rPr>
         <w:t>1.2 Alcance y límites</w:t>
-      </w:r>
-      <w:r>
-        <w:rPr>
-          <w:lang w:val="es-ES"/>
-        </w:rPr>
         <w:tab/>
         <w:t>6</w:t>
       </w:r>
@@ -778,11 +858,6 @@
           <w:lang w:val="es-ES"/>
         </w:rPr>
         <w:t>2 Acceso y navegación</w:t>
-      </w:r>
-      <w:r>
-        <w:rPr>
-          <w:lang w:val="es-ES"/>
-        </w:rPr>
         <w:tab/>
         <w:t>6</w:t>
       </w:r>
@@ -802,11 +877,6 @@
           <w:lang w:val="es-ES"/>
         </w:rPr>
         <w:t>2.1 Preparación y acceso</w:t>
-      </w:r>
-      <w:r>
-        <w:rPr>
-          <w:lang w:val="es-ES"/>
-        </w:rPr>
         <w:tab/>
         <w:t>6</w:t>
       </w:r>
@@ -826,11 +896,6 @@
           <w:lang w:val="es-ES"/>
         </w:rPr>
         <w:t>2.2 Inicio y menú</w:t>
-      </w:r>
-      <w:r>
-        <w:rPr>
-          <w:lang w:val="es-ES"/>
-        </w:rPr>
         <w:tab/>
         <w:t>7</w:t>
       </w:r>
@@ -850,13 +915,27 @@
           <w:lang w:val="es-ES"/>
         </w:rPr>
         <w:t>2.3 Elementos comunes</w:t>
-      </w:r>
-      <w:r>
-        <w:rPr>
-          <w:lang w:val="es-ES"/>
-        </w:rPr>
         <w:tab/>
         <w:t>8</w:t>
+      </w:r>
+    </w:p>
+    <w:p>
+      <w:pPr>
+        <w:pStyle w:val="TDC2"/>
+        <w:tabs>
+          <w:tab w:val="right" w:leader="dot" w:pos="9360"/>
+        </w:tabs>
+        <w:rPr>
+          <w:lang w:val="es-ES"/>
+        </w:rPr>
+      </w:pPr>
+      <w:r>
+        <w:rPr>
+          <w:lang w:val="es-ES"/>
+        </w:rPr>
+        <w:t>2.4 Ayuda y Sobre nosotros</w:t>
+        <w:tab/>
+        <w:t>9</w:t>
       </w:r>
     </w:p>
     <w:p>
@@ -874,13 +953,8 @@
           <w:lang w:val="es-ES"/>
         </w:rPr>
         <w:t>3 Gestión de clientes</w:t>
-      </w:r>
-      <w:r>
-        <w:rPr>
-          <w:lang w:val="es-ES"/>
-        </w:rPr>
         <w:tab/>
-        <w:t>9</w:t>
+        <w:t>10</w:t>
       </w:r>
     </w:p>
     <w:p>
@@ -898,13 +972,8 @@
           <w:lang w:val="es-ES"/>
         </w:rPr>
         <w:t>3.1 Registrar un cliente</w:t>
-      </w:r>
-      <w:r>
-        <w:rPr>
-          <w:lang w:val="es-ES"/>
-        </w:rPr>
         <w:tab/>
-        <w:t>9</w:t>
+        <w:t>10</w:t>
       </w:r>
     </w:p>
     <w:p>
@@ -922,13 +991,8 @@
           <w:lang w:val="es-ES"/>
         </w:rPr>
         <w:t>3.2 Consultar, editar y eliminar</w:t>
-      </w:r>
-      <w:r>
-        <w:rPr>
-          <w:lang w:val="es-ES"/>
-        </w:rPr>
         <w:tab/>
-        <w:t>10</w:t>
+        <w:t>11</w:t>
       </w:r>
     </w:p>
     <w:p>
@@ -946,13 +1010,8 @@
           <w:lang w:val="es-ES"/>
         </w:rPr>
         <w:t>4 Gestión de productos</w:t>
-      </w:r>
-      <w:r>
-        <w:rPr>
-          <w:lang w:val="es-ES"/>
-        </w:rPr>
         <w:tab/>
-        <w:t>11</w:t>
+        <w:t>16</w:t>
       </w:r>
     </w:p>
     <w:p>
@@ -970,13 +1029,8 @@
           <w:lang w:val="es-ES"/>
         </w:rPr>
         <w:t>4.1 Registrar un producto</w:t>
-      </w:r>
-      <w:r>
-        <w:rPr>
-          <w:lang w:val="es-ES"/>
-        </w:rPr>
         <w:tab/>
-        <w:t>11</w:t>
+        <w:t>16</w:t>
       </w:r>
     </w:p>
     <w:p>
@@ -994,13 +1048,8 @@
           <w:lang w:val="es-ES"/>
         </w:rPr>
         <w:t>4.2 Consultar, editar y eliminar</w:t>
-      </w:r>
-      <w:r>
-        <w:rPr>
-          <w:lang w:val="es-ES"/>
-        </w:rPr>
         <w:tab/>
-        <w:t>12</w:t>
+        <w:t>17</w:t>
       </w:r>
     </w:p>
     <w:p>
@@ -1018,13 +1067,8 @@
           <w:lang w:val="es-ES"/>
         </w:rPr>
         <w:t>5 Ventas y facturas</w:t>
-      </w:r>
-      <w:r>
-        <w:rPr>
-          <w:lang w:val="es-ES"/>
-        </w:rPr>
         <w:tab/>
-        <w:t>12</w:t>
+        <w:t>20</w:t>
       </w:r>
     </w:p>
     <w:p>
@@ -1042,13 +1086,8 @@
           <w:lang w:val="es-ES"/>
         </w:rPr>
         <w:t>5.1 Registrar una venta</w:t>
-      </w:r>
-      <w:r>
-        <w:rPr>
-          <w:lang w:val="es-ES"/>
-        </w:rPr>
         <w:tab/>
-        <w:t>12</w:t>
+        <w:t>21</w:t>
       </w:r>
     </w:p>
     <w:p>
@@ -1066,13 +1105,8 @@
           <w:lang w:val="es-ES"/>
         </w:rPr>
         <w:t>5.2 Consultar e imprimir</w:t>
-      </w:r>
-      <w:r>
-        <w:rPr>
-          <w:lang w:val="es-ES"/>
-        </w:rPr>
         <w:tab/>
-        <w:t>14</w:t>
+        <w:t>22</w:t>
       </w:r>
     </w:p>
     <w:p>
@@ -1090,13 +1124,27 @@
           <w:lang w:val="es-ES"/>
         </w:rPr>
         <w:t>5.3 Cancelar una factura</w:t>
-      </w:r>
-      <w:r>
-        <w:rPr>
-          <w:lang w:val="es-ES"/>
-        </w:rPr>
         <w:tab/>
-        <w:t>15</w:t>
+        <w:t>23</w:t>
+      </w:r>
+    </w:p>
+    <w:p>
+      <w:pPr>
+        <w:pStyle w:val="TDC2"/>
+        <w:tabs>
+          <w:tab w:val="right" w:leader="dot" w:pos="9360"/>
+        </w:tabs>
+        <w:rPr>
+          <w:lang w:val="es-ES"/>
+        </w:rPr>
+      </w:pPr>
+      <w:r>
+        <w:rPr>
+          <w:lang w:val="es-ES"/>
+        </w:rPr>
+        <w:t>5.4 Registrar el pago de una venta por cobrar</w:t>
+        <w:tab/>
+        <w:t>26</w:t>
       </w:r>
     </w:p>
     <w:p>
@@ -1115,13 +1163,8 @@
         </w:rPr>
         <w:lastRenderedPageBreak/>
         <w:t>6 Reportes</w:t>
-      </w:r>
-      <w:r>
-        <w:rPr>
-          <w:lang w:val="es-ES"/>
-        </w:rPr>
         <w:tab/>
-        <w:t>16</w:t>
+        <w:t>27</w:t>
       </w:r>
     </w:p>
     <w:p>
@@ -1139,13 +1182,8 @@
           <w:lang w:val="es-ES"/>
         </w:rPr>
         <w:t>6.1 Resumen general</w:t>
-      </w:r>
-      <w:r>
-        <w:rPr>
-          <w:lang w:val="es-ES"/>
-        </w:rPr>
         <w:tab/>
-        <w:t>16</w:t>
+        <w:t>28</w:t>
       </w:r>
     </w:p>
     <w:p>
@@ -1163,13 +1201,8 @@
           <w:lang w:val="es-ES"/>
         </w:rPr>
         <w:t>6.2 Clientes y cantidad de facturas</w:t>
-      </w:r>
-      <w:r>
-        <w:rPr>
-          <w:lang w:val="es-ES"/>
-        </w:rPr>
         <w:tab/>
-        <w:t>16</w:t>
+        <w:t>28</w:t>
       </w:r>
     </w:p>
     <w:p>
@@ -1186,14 +1219,9 @@
         <w:rPr>
           <w:lang w:val="es-ES"/>
         </w:rPr>
-        <w:t>6.3 Total vigente por factura</w:t>
-      </w:r>
-      <w:r>
-        <w:rPr>
-          <w:lang w:val="es-ES"/>
-        </w:rPr>
+        <w:t>6.3 Total por factura</w:t>
         <w:tab/>
-        <w:t>17</w:t>
+        <w:t>29</w:t>
       </w:r>
     </w:p>
     <w:p>
@@ -1210,14 +1238,9 @@
         <w:rPr>
           <w:lang w:val="es-ES"/>
         </w:rPr>
-        <w:t>6.4 Unidades facturadas por producto</w:t>
-      </w:r>
-      <w:r>
-        <w:rPr>
-          <w:lang w:val="es-ES"/>
-        </w:rPr>
+        <w:t>6.4 Unidades vendidas por producto</w:t>
         <w:tab/>
-        <w:t>17</w:t>
+        <w:t>30</w:t>
       </w:r>
     </w:p>
     <w:p>
@@ -1235,13 +1258,8 @@
           <w:lang w:val="es-ES"/>
         </w:rPr>
         <w:t>6.5 Detalle de facturas</w:t>
-      </w:r>
-      <w:r>
-        <w:rPr>
-          <w:lang w:val="es-ES"/>
-        </w:rPr>
         <w:tab/>
-        <w:t>18</w:t>
+        <w:t>31</w:t>
       </w:r>
     </w:p>
     <w:p>
@@ -1259,13 +1277,8 @@
           <w:lang w:val="es-ES"/>
         </w:rPr>
         <w:t>6.6 Existencias de productos</w:t>
-      </w:r>
-      <w:r>
-        <w:rPr>
-          <w:lang w:val="es-ES"/>
-        </w:rPr>
         <w:tab/>
-        <w:t>19</w:t>
+        <w:t>32</w:t>
       </w:r>
     </w:p>
     <w:p>
@@ -1283,13 +1296,8 @@
           <w:lang w:val="es-ES"/>
         </w:rPr>
         <w:t>6.7 Facturas por estado</w:t>
-      </w:r>
-      <w:r>
-        <w:rPr>
-          <w:lang w:val="es-ES"/>
-        </w:rPr>
         <w:tab/>
-        <w:t>19</w:t>
+        <w:t>33</w:t>
       </w:r>
     </w:p>
     <w:p>
@@ -1307,13 +1315,8 @@
           <w:lang w:val="es-ES"/>
         </w:rPr>
         <w:t>6.8 Facturas pendientes</w:t>
-      </w:r>
-      <w:r>
-        <w:rPr>
-          <w:lang w:val="es-ES"/>
-        </w:rPr>
         <w:tab/>
-        <w:t>20</w:t>
+        <w:t>34</w:t>
       </w:r>
     </w:p>
     <w:p>
@@ -1331,13 +1334,8 @@
           <w:lang w:val="es-ES"/>
         </w:rPr>
         <w:t>6.9 Lectura de importes</w:t>
-      </w:r>
-      <w:r>
-        <w:rPr>
-          <w:lang w:val="es-ES"/>
-        </w:rPr>
         <w:tab/>
-        <w:t>20</w:t>
+        <w:t>35</w:t>
       </w:r>
     </w:p>
     <w:p>
@@ -1355,13 +1353,8 @@
           <w:lang w:val="es-ES"/>
         </w:rPr>
         <w:t>7 Situaciones frecuentes</w:t>
-      </w:r>
-      <w:r>
-        <w:rPr>
-          <w:lang w:val="es-ES"/>
-        </w:rPr>
         <w:tab/>
-        <w:t>20</w:t>
+        <w:t>35</w:t>
       </w:r>
     </w:p>
     <w:p>
@@ -1379,13 +1372,8 @@
           <w:lang w:val="es-ES"/>
         </w:rPr>
         <w:t>8 Glosario</w:t>
-      </w:r>
-      <w:r>
-        <w:rPr>
-          <w:lang w:val="es-ES"/>
-        </w:rPr>
         <w:tab/>
-        <w:t>22</w:t>
+        <w:t>38</w:t>
       </w:r>
     </w:p>
     <w:p>
@@ -1403,13 +1391,8 @@
           <w:lang w:val="es-ES"/>
         </w:rPr>
         <w:t>Referencias</w:t>
-      </w:r>
-      <w:r>
-        <w:rPr>
-          <w:lang w:val="es-ES"/>
-        </w:rPr>
         <w:tab/>
-        <w:t>23</w:t>
+        <w:t>39</w:t>
       </w:r>
     </w:p>
     <w:p>
@@ -1438,7 +1421,7 @@
         <w:rPr>
           <w:lang w:val="es-ES"/>
         </w:rPr>
-        <w:t>La Única es una aplicación web local para apoyar el registro de clientes y productos, la consulta de existencias, la creación y cancelación de ventas y la revisión de reportes. El usuario trabaja desde un navegador y navega por las secciones Inicio, Facturas, Clientes, Productos y Reportes. El sistema no presenta una pantalla de inicio de sesión ni administra cuentas de usuario.</w:t>
+        <w:t xml:space="preserve">La Única es una aplicación web local para apoyar el registro de clientes y productos, la consulta de existencias, la creación, el cobro y la cancelación de ventas y la revisión de reportes. El usuario trabaja desde un navegador y navega por las secciones Inicio, Facturas, Clientes, Productos, Reportes y Sobre nosotros. El sistema no presenta una pantalla de inicio de sesión ni administra cuentas de usuario.</w:t>
       </w:r>
     </w:p>
     <w:p>
@@ -1464,7 +1447,7 @@
         <w:rPr>
           <w:lang w:val="es-ES"/>
         </w:rPr>
-        <w:t>Una venta guardada queda en estado Pagado y descuenta existencias. La cancelación de una factura pagada cambia su estado a Cancelado y repone las cantidades una sola vez. El total de las facturas se presenta con los precios vigentes del catálogo; la aplicación no conserva el precio histórico aplicado al momento de cada venta. El comprobante es de uso interno y no constituye una factura fiscal o electrónica.</w:t>
+        <w:t xml:space="preserve">Una venta puede guardarse de contado, en estado Pagado, o por cobrar, en estado Pendiente; en ambos casos descuenta existencias. Cuando el cliente paga una venta pendiente, el operador registra el pago y la factura pasa a Pagado. La cancelación de una factura Pagado o Pendiente cambia su estado a Cancelado y repone las cantidades una sola vez. Cada factura guarda el precio de cada producto en el momento de la venta, de modo que un cambio posterior en el catálogo no altera su total. El comprobante es de uso interno y no constituye una factura fiscal o electrónica.</w:t>
       </w:r>
     </w:p>
     <w:p>
@@ -1534,20 +1517,20 @@
         <w:rPr>
           <w:lang w:val="es-ES"/>
         </w:rPr>
-        <w:t>El manual cubre las funciones expuestas en la interfaz: gestión de clientes y productos, registro y consulta de facturas, impresión del comprobante, cancelación de ventas y lectura del resumen y los reportes individuales. El aplicativo funciona en un entorno local y está planteado para un operador.</w:t>
-      </w:r>
-    </w:p>
-    <w:p>
-      <w:pPr>
-        <w:rPr>
-          <w:lang w:val="es-ES"/>
-        </w:rPr>
-      </w:pPr>
-      <w:r>
-        <w:rPr>
-          <w:lang w:val="es-ES"/>
-        </w:rPr>
-        <w:t>La versión descrita no ofrece cuentas, roles, recuperación de contraseñas, gestión de categorías, cobro electrónico, descuentos, cálculo de impuestos ni facturación fiscal o electrónica. Tampoco permite editar una factura guardada. El precio histórico no se almacena en el detalle: las consultas obtienen el precio vigente del producto (Equipo del proyecto, 2026a, 2026c).</w:t>
+        <w:t xml:space="preserve">El manual cubre las funciones expuestas en la interfaz: gestión de clientes y productos, registro, cobro y consulta de facturas, impresión del comprobante, cancelación de ventas, lectura del resumen y los reportes individuales, y consulta de la ayuda en Sobre nosotros. El aplicativo funciona en un entorno local y está planteado para un operador.</w:t>
+      </w:r>
+    </w:p>
+    <w:p>
+      <w:pPr>
+        <w:rPr>
+          <w:lang w:val="es-ES"/>
+        </w:rPr>
+      </w:pPr>
+      <w:r>
+        <w:rPr>
+          <w:lang w:val="es-ES"/>
+        </w:rPr>
+        <w:t xml:space="preserve">La versión descrita no ofrece cuentas, roles, recuperación de contraseñas, gestión de categorías, cobro electrónico, descuentos, cálculo de impuestos ni facturación fiscal o electrónica. Tampoco permite editar una factura guardada. Registrar el pago de una venta por cobrar solo cambia su estado; no procesa dinero ni medios de pago (Equipo del proyecto, 2026a, 2026c).</w:t>
       </w:r>
     </w:p>
     <w:p>
@@ -2006,6 +1989,63 @@
           </w:p>
         </w:tc>
       </w:tr>
+      <w:tr>
+        <w:trPr>
+          <w:cantSplit/>
+        </w:trPr>
+        <w:tc>
+          <w:tcPr>
+            <w:tcW w:w="2880" w:type="dxa"/>
+            <w:tcMar>
+              <w:top w:w="90" w:type="dxa"/>
+              <w:left w:w="100" w:type="dxa"/>
+              <w:bottom w:w="90" w:type="dxa"/>
+              <w:right w:w="100" w:type="dxa"/>
+            </w:tcMar>
+            <w:vAlign w:val="center"/>
+          </w:tcPr>
+          <w:p>
+            <w:pPr>
+              <w:spacing w:line="360" w:lineRule="auto"/>
+              <w:ind w:firstLine="0"/>
+            </w:pPr>
+            <w:r>
+              <w:rPr>
+                <w:rFonts w:eastAsia="Arial" w:cs="Arial"/>
+              </w:rPr>
+              <w:t xml:space="preserve">Sobre nosotros</w:t>
+            </w:r>
+          </w:p>
+        </w:tc>
+        <w:tc>
+          <w:tcPr>
+            <w:tcW w:w="6480" w:type="dxa"/>
+            <w:tcMar>
+              <w:top w:w="90" w:type="dxa"/>
+              <w:left w:w="100" w:type="dxa"/>
+              <w:bottom w:w="90" w:type="dxa"/>
+              <w:right w:w="100" w:type="dxa"/>
+            </w:tcMar>
+            <w:vAlign w:val="center"/>
+          </w:tcPr>
+          <w:p>
+            <w:pPr>
+              <w:spacing w:line="360" w:lineRule="auto"/>
+              <w:ind w:firstLine="0"/>
+              <w:rPr>
+                <w:lang w:val="es-ES"/>
+              </w:rPr>
+            </w:pPr>
+            <w:r>
+              <w:rPr>
+                <w:rFonts w:eastAsia="Arial" w:cs="Arial"/>
+                <w:lang w:val="es-ES"/>
+              </w:rPr>
+              <w:t xml:space="preserve">Consultar el manual de usuario, el video explicativo y la wiki del proyecto.</w:t>
+            </w:r>
+          </w:p>
+        </w:tc>
+      </w:tr>
     </w:tbl>
     <w:p>
       <w:pPr>
@@ -2139,7 +2179,7 @@
         <w:t xml:space="preserve">Las acciones de una fila permiten abrir o modificar el registro cuando la operación está disponible. </w:t>
       </w:r>
       <w:r>
-        <w:t>Las operaciones de eliminación y cancelación piden confirmación.</w:t>
+        <w:t xml:space="preserve">Las operaciones de eliminación, cancelación y registro de pago piden confirmación.</w:t>
       </w:r>
     </w:p>
     <w:p>
@@ -2170,14 +2210,7 @@
           <w:rFonts w:eastAsia="Arial" w:cs="Arial"/>
           <w:i/>
         </w:rPr>
-        <w:t xml:space="preserve">Controles </w:t>
-      </w:r>
-      <w:r>
-        <w:rPr>
-          <w:rFonts w:eastAsia="Arial" w:cs="Arial"/>
-          <w:i/>
-        </w:rPr>
-        <w:t>communes</w:t>
+        <w:t xml:space="preserve">Controles comunes</w:t>
       </w:r>
     </w:p>
     <w:p>
@@ -2226,6 +2259,112 @@
     </w:p>
     <w:p>
       <w:pPr>
+        <w:pStyle w:val="Ttulo2"/>
+        <w:keepNext/>
+      </w:pPr>
+      <w:r>
+        <w:t xml:space="preserve">2.4 Ayuda y Sobre nosotros</w:t>
+      </w:r>
+    </w:p>
+    <w:p>
+      <w:pPr>
+        <w:keepLines/>
+        <w:rPr>
+          <w:lang w:val="es-ES"/>
+        </w:rPr>
+      </w:pPr>
+      <w:r>
+        <w:rPr>
+          <w:lang w:val="es-ES"/>
+        </w:rPr>
+        <w:t xml:space="preserve">Seleccione Sobre nosotros en el menú para abrir la ayuda del aplicativo. La página ofrece tres accesos: Manual del Usuario, que muestra este documento en PDF dentro del navegador; Video explicativo, que reproduce una presentación de las funciones principales; y Wiki, con guías paso a paso, solución de problemas y notas técnicas.</w:t>
+      </w:r>
+    </w:p>
+    <w:p>
+      <w:pPr>
+        <w:keepLines/>
+        <w:rPr>
+          <w:lang w:val="es-ES"/>
+        </w:rPr>
+      </w:pPr>
+      <w:r>
+        <w:rPr>
+          <w:lang w:val="es-ES"/>
+        </w:rPr>
+        <w:t xml:space="preserve">El manual y el video se pueden consultar aunque la base de datos no esté disponible, por lo que sirven de apoyo cuando las demás secciones muestran un error de conexión.</w:t>
+      </w:r>
+    </w:p>
+    <w:p>
+      <w:pPr>
+        <w:keepNext/>
+        <w:spacing w:before="100" w:line="240" w:lineRule="auto"/>
+        <w:rPr>
+          <w:lang w:val="es-ES"/>
+        </w:rPr>
+      </w:pPr>
+      <w:r>
+        <w:rPr>
+          <w:rFonts w:eastAsia="Arial" w:cs="Arial"/>
+          <w:b/>
+          <w:lang w:val="es-ES"/>
+        </w:rPr>
+        <w:t xml:space="preserve">Figura 3</w:t>
+      </w:r>
+    </w:p>
+    <w:p>
+      <w:pPr>
+        <w:keepNext/>
+        <w:spacing w:line="240" w:lineRule="auto"/>
+        <w:rPr>
+          <w:lang w:val="es-ES"/>
+        </w:rPr>
+      </w:pPr>
+      <w:r>
+        <w:rPr>
+          <w:rFonts w:eastAsia="Arial" w:cs="Arial"/>
+          <w:i/>
+          <w:lang w:val="es-ES"/>
+        </w:rPr>
+        <w:t>Sobre nosotros</w:t>
+        <w:drawing>
+          <wp:inline distT="0" distB="0" distL="0" distR="0" wp14:anchorId="195A35FC" wp14:editId="18D3FA15">
+            <wp:extent cx="5943600" cy="3823770"/>
+            <wp:effectExtent l="0" t="0" r="0" b="0"/>
+            <wp:docPr id="2050044062" name="Imagen 1"/>
+            <wp:cNvGraphicFramePr>
+              <a:graphicFrameLocks xmlns:a="http://schemas.openxmlformats.org/drawingml/2006/main" noChangeAspect="1"/>
+            </wp:cNvGraphicFramePr>
+            <a:graphic xmlns:a="http://schemas.openxmlformats.org/drawingml/2006/main">
+              <a:graphicData uri="http://schemas.openxmlformats.org/drawingml/2006/picture">
+                <pic:pic xmlns:pic="http://schemas.openxmlformats.org/drawingml/2006/picture">
+                  <pic:nvPicPr>
+                    <pic:cNvPr id="1707175848" name=""/>
+                    <pic:cNvPicPr/>
+                  </pic:nvPicPr>
+                  <pic:blipFill>
+                    <a:blip r:embed="rId37"/>
+                    <a:stretch>
+                      <a:fillRect/>
+                    </a:stretch>
+                  </pic:blipFill>
+                  <pic:spPr>
+                    <a:xfrm>
+                      <a:off x="0" y="0"/>
+                      <a:ext cx="5943600" cy="3823770"/>
+                    </a:xfrm>
+                    <a:prstGeom prst="rect">
+                      <a:avLst/>
+                    </a:prstGeom>
+                  </pic:spPr>
+                </pic:pic>
+              </a:graphicData>
+            </a:graphic>
+          </wp:inline>
+        </w:drawing>
+      </w:r>
+    </w:p>
+    <w:p>
+      <w:pPr>
         <w:pStyle w:val="Ttulo1"/>
         <w:rPr>
           <w:lang w:val="es-ES"/>
@@ -2270,7 +2409,7 @@
         <w:rPr>
           <w:lang w:val="es-ES"/>
         </w:rPr>
-        <w:t>Desde el menú, seleccione Nuevo cliente. Complete el formulario con un identificador numérico entero positivo que no esté asignado a otro cliente y el nombre del comprador. El nombre es obligatorio y admite hasta 100 caracteres. La fecha de registro es opcional: si se deja vacía, el sistema asigna la fecha actual.</w:t>
+        <w:t xml:space="preserve">Desde el menú, seleccione Nuevo cliente. Complete el formulario con un identificador numérico entero positivo que no esté asignado a otro cliente y el nombre del comprador. El nombre es obligatorio y admite hasta 100 caracteres. La fecha de registro es opcional: si se deja vacía, el sistema asigna la fecha actual. Puede indicar una fecha anterior para un cliente antiguo, pero no una posterior a hoy.</w:t>
       </w:r>
     </w:p>
     <w:p>
@@ -2285,11 +2424,6 @@
           <w:lang w:val="es-ES"/>
         </w:rPr>
         <w:t>1.</w:t>
-      </w:r>
-      <w:r>
-        <w:rPr>
-          <w:lang w:val="es-ES"/>
-        </w:rPr>
         <w:tab/>
         <w:t>Ingrese el ID del cliente según el identificador comercial que utiliza la tienda.</w:t>
       </w:r>
@@ -2306,13 +2440,8 @@
           <w:lang w:val="es-ES"/>
         </w:rPr>
         <w:t>2.</w:t>
-      </w:r>
-      <w:r>
-        <w:rPr>
-          <w:lang w:val="es-ES"/>
-        </w:rPr>
         <w:tab/>
-        <w:t>Escriba el nombre y, si corresponde, seleccione una fecha de registro.</w:t>
+        <w:t>Escriba el nombre y, si corresponde, seleccione una fecha de registro que no sea posterior a hoy.</w:t>
       </w:r>
     </w:p>
     <w:p>
@@ -2327,11 +2456,6 @@
           <w:lang w:val="es-ES"/>
         </w:rPr>
         <w:t>3.</w:t>
-      </w:r>
-      <w:r>
-        <w:rPr>
-          <w:lang w:val="es-ES"/>
-        </w:rPr>
         <w:tab/>
         <w:t>Revise los datos y seleccione el botón para guardar. Si el sistema informa que el ID ya existe o que un dato no es válido, corrija el campo indicado y vuelva a enviar.</w:t>
       </w:r>
@@ -2364,7 +2488,7 @@
           <w:b/>
           <w:lang w:val="es-ES"/>
         </w:rPr>
-        <w:t>Figura 3</w:t>
+        <w:t>Figura 4</w:t>
       </w:r>
     </w:p>
     <w:p>
@@ -2384,16 +2508,9 @@
           <w:lang w:val="es-ES"/>
         </w:rPr>
         <w:t>Registro de cliente</w:t>
-      </w:r>
-      <w:r>
-        <w:rPr>
-          <w:rFonts w:eastAsia="Arial" w:cs="Arial"/>
-          <w:i/>
-          <w:lang w:val="es-ES"/>
-        </w:rPr>
         <w:drawing>
           <wp:inline distT="0" distB="0" distL="0" distR="0" wp14:anchorId="6552B3E7" wp14:editId="54BF4F7A">
-            <wp:extent cx="5943600" cy="3764915"/>
+            <wp:extent cx="5943600" cy="3823770"/>
             <wp:effectExtent l="0" t="0" r="0" b="6985"/>
             <wp:docPr id="607067802" name="Imagen 1"/>
             <wp:cNvGraphicFramePr>
@@ -2415,7 +2532,7 @@
                   <pic:spPr>
                     <a:xfrm>
                       <a:off x="0" y="0"/>
-                      <a:ext cx="5943600" cy="3764915"/>
+                      <a:ext cx="5943600" cy="3823770"/>
                     </a:xfrm>
                     <a:prstGeom prst="rect">
                       <a:avLst/>
@@ -2489,11 +2606,6 @@
           <w:lang w:val="es-ES"/>
         </w:rPr>
         <w:t xml:space="preserve">Para cambiar el nombre, use la acción de edición de la fila, actualice el campo y guarde. La fecha de registro aparece en modo de consulta. Para eliminar un registro, </w:t>
-      </w:r>
-      <w:r>
-        <w:rPr>
-          <w:lang w:val="es-ES"/>
-        </w:rPr>
         <w:lastRenderedPageBreak/>
         <w:t>use la acción de eliminación y confirme solo si está seguro: el sistema no permite eliminar clientes relacionados con facturas.</w:t>
       </w:r>
@@ -2513,7 +2625,7 @@
           <w:lang w:val="es-ES"/>
         </w:rPr>
         <w:lastRenderedPageBreak/>
-        <w:t>Figura 4</w:t>
+        <w:t>Figura 5</w:t>
       </w:r>
     </w:p>
     <w:p>
@@ -2749,13 +2861,6 @@
           <w:lang w:val="es-ES"/>
         </w:rPr>
         <w:t>Eliminación</w:t>
-      </w:r>
-      <w:r>
-        <w:rPr>
-          <w:b/>
-          <w:bCs/>
-          <w:lang w:val="es-ES"/>
-        </w:rPr>
         <w:drawing>
           <wp:inline distT="0" distB="0" distL="0" distR="0" wp14:anchorId="1BB315E1" wp14:editId="3315FEAA">
             <wp:extent cx="5943600" cy="3745865"/>
@@ -3057,11 +3162,6 @@
           <w:lang w:val="es-ES"/>
         </w:rPr>
         <w:t>1.</w:t>
-      </w:r>
-      <w:r>
-        <w:rPr>
-          <w:lang w:val="es-ES"/>
-        </w:rPr>
         <w:tab/>
         <w:t>Escriba el nombre y la unidad de medida que utilizará la tienda para contar el artículo.</w:t>
       </w:r>
@@ -3078,11 +3178,6 @@
           <w:lang w:val="es-ES"/>
         </w:rPr>
         <w:t>2.</w:t>
-      </w:r>
-      <w:r>
-        <w:rPr>
-          <w:lang w:val="es-ES"/>
-        </w:rPr>
         <w:tab/>
         <w:t>Ingrese las existencias iniciales. Use cero si todavía no hay unidades disponibles.</w:t>
       </w:r>
@@ -3099,11 +3194,6 @@
           <w:lang w:val="es-ES"/>
         </w:rPr>
         <w:t>3.</w:t>
-      </w:r>
-      <w:r>
-        <w:rPr>
-          <w:lang w:val="es-ES"/>
-        </w:rPr>
         <w:tab/>
         <w:t>Ingrese el precio de venta por unidad de medida, revise los datos y guarde el producto.</w:t>
       </w:r>
@@ -3136,7 +3226,7 @@
           <w:b/>
           <w:lang w:val="es-ES"/>
         </w:rPr>
-        <w:t>Figura 5</w:t>
+        <w:t>Figura 6</w:t>
       </w:r>
     </w:p>
     <w:p>
@@ -3154,13 +3244,6 @@
           <w:lang w:val="es-ES"/>
         </w:rPr>
         <w:t>Registro de producto</w:t>
-      </w:r>
-      <w:r>
-        <w:rPr>
-          <w:rFonts w:eastAsia="Arial" w:cs="Arial"/>
-          <w:i/>
-          <w:lang w:val="es-ES"/>
-        </w:rPr>
         <w:drawing>
           <wp:inline distT="0" distB="0" distL="0" distR="0" wp14:anchorId="3E62AE80" wp14:editId="3991C7B2">
             <wp:extent cx="5943600" cy="4715510"/>
@@ -3230,7 +3313,7 @@
         <w:rPr>
           <w:lang w:val="es-ES"/>
         </w:rPr>
-        <w:t>Abra Productos y busque por ID o nombre. El listado permite consultar la unidad, existencias y precio vigentes. Para editar, abra la acción de la fila y guarde los datos actualizados.</w:t>
+        <w:t xml:space="preserve">Abra Productos y busque por ID o nombre. El listado permite consultar la unidad, las existencias y el precio actual de cada producto. Para editar, abra la acción de la fila y guarde los datos actualizados.</w:t>
       </w:r>
     </w:p>
     <w:p>
@@ -3244,21 +3327,20 @@
         <w:rPr>
           <w:lang w:val="es-ES"/>
         </w:rPr>
-        <w:lastRenderedPageBreak/>
-        <w:t>Al corregir el inventario, ingrese la cantidad total que debe quedar disponible; el campo fija el nuevo stock y no representa una suma o resta automática. Verifique el conteo físico antes de guardarlo.</w:t>
-      </w:r>
-    </w:p>
-    <w:p>
-      <w:pPr>
-        <w:rPr>
-          <w:lang w:val="es-ES"/>
-        </w:rPr>
-      </w:pPr>
-      <w:r>
-        <w:rPr>
-          <w:lang w:val="es-ES"/>
-        </w:rPr>
-        <w:t>Si el producto ya aparece en detalles de factura, no se puede cambiar su unidad de medida ni eliminarlo. El nombre, el stock y el precio sí se pueden actualizar. Un cambio de precio afecta los importes que el sistema vuelve a calcular para facturas anteriores, porque no se guarda un precio histórico por detalle (Equipo del proyecto, 2026a, 2026b, 2026c).</w:t>
+        <w:t xml:space="preserve">Al corregir el inventario, ingrese la cantidad total que debe quedar disponible; el campo fija el nuevo stock y no representa una suma o resta automática. Verifique el conteo físico antes de guardarlo. Si solo cambia el nombre o el precio y deja el stock igual, el sistema conserva las existencias actuales, aunque se haya registrado una venta mientras editaba.</w:t>
+      </w:r>
+    </w:p>
+    <w:p>
+      <w:pPr>
+        <w:rPr>
+          <w:lang w:val="es-ES"/>
+        </w:rPr>
+      </w:pPr>
+      <w:r>
+        <w:rPr>
+          <w:lang w:val="es-ES"/>
+        </w:rPr>
+        <w:t xml:space="preserve">Si el producto ya aparece en detalles de factura, no se puede cambiar su unidad de medida ni eliminarlo. El nombre, el stock y el precio sí se pueden actualizar. Un cambio de precio solo se aplica a las ventas nuevas: cada factura conserva el precio con el que se registró (Equipo del proyecto, 2026a, 2026c).</w:t>
       </w:r>
     </w:p>
     <w:p>
@@ -3276,7 +3358,7 @@
           <w:lang w:val="es-ES"/>
         </w:rPr>
         <w:lastRenderedPageBreak/>
-        <w:t>Figura 6</w:t>
+        <w:t>Figura 7</w:t>
       </w:r>
     </w:p>
     <w:p>
@@ -3447,13 +3529,6 @@
         </w:rPr>
         <w:lastRenderedPageBreak/>
         <w:t>Eliminación</w:t>
-      </w:r>
-      <w:r>
-        <w:rPr>
-          <w:b/>
-          <w:bCs/>
-          <w:lang w:val="es-ES"/>
-        </w:rPr>
         <w:drawing>
           <wp:inline distT="0" distB="0" distL="0" distR="0" wp14:anchorId="3AC49281" wp14:editId="12ED55AF">
             <wp:extent cx="5943600" cy="3806825"/>
@@ -3594,7 +3669,7 @@
         <w:rPr>
           <w:lang w:val="es-ES"/>
         </w:rPr>
-        <w:t>Antes de comenzar, confirme que el cliente esté registrado y que los productos tengan existencias. En el menú Ventas, abra Nueva factura. El formulario requiere un cliente y al menos un producto. Cada producto se agrega una sola vez por factura; ajuste su cantidad en la misma línea. Se admiten cantidades enteras positivas.</w:t>
+        <w:t xml:space="preserve">Antes de comenzar, confirme que el cliente esté registrado y que los productos tengan existencias. En el menú Ventas, abra Nueva factura. El formulario requiere un cliente, la forma de pago y al menos un producto. Cada producto se agrega una sola vez por factura; ajuste su cantidad en la misma línea. Se admiten cantidades enteras positivas.</w:t>
       </w:r>
     </w:p>
     <w:p>
@@ -3609,11 +3684,6 @@
           <w:lang w:val="es-ES"/>
         </w:rPr>
         <w:t>1.</w:t>
-      </w:r>
-      <w:r>
-        <w:rPr>
-          <w:lang w:val="es-ES"/>
-        </w:rPr>
         <w:tab/>
         <w:t>Seleccione el cliente en la lista. Cada opción muestra el nombre y el ID para ayudar a distinguir compradores.</w:t>
       </w:r>
@@ -3630,13 +3700,8 @@
           <w:lang w:val="es-ES"/>
         </w:rPr>
         <w:t>2.</w:t>
-      </w:r>
-      <w:r>
-        <w:rPr>
-          <w:lang w:val="es-ES"/>
-        </w:rPr>
         <w:tab/>
-        <w:t>Seleccione un producto. El formulario muestra su precio vigente y stock disponible; verifique ambos datos antes de continuar.</w:t>
+        <w:t>Elija la forma de pago: De contado (Pagado) si el cliente paga en el momento, o Por cobrar (Pendiente) si pagará después.</w:t>
       </w:r>
     </w:p>
     <w:p>
@@ -3651,11 +3716,22 @@
           <w:lang w:val="es-ES"/>
         </w:rPr>
         <w:t>3.</w:t>
-      </w:r>
-      <w:r>
-        <w:rPr>
-          <w:lang w:val="es-ES"/>
-        </w:rPr>
+        <w:tab/>
+        <w:t>Seleccione un producto. El formulario muestra su precio y su stock disponible; verifique ambos datos antes de continuar.</w:t>
+      </w:r>
+    </w:p>
+    <w:p>
+      <w:pPr>
+        <w:ind w:left="720" w:hanging="360"/>
+        <w:rPr>
+          <w:lang w:val="es-ES"/>
+        </w:rPr>
+      </w:pPr>
+      <w:r>
+        <w:rPr>
+          <w:lang w:val="es-ES"/>
+        </w:rPr>
+        <w:t>4.</w:t>
         <w:tab/>
         <w:t>Ingrese la cantidad y use Agregar producto para incluir otra línea. Para retirar una línea, seleccione Quitar. Revise que el total estimado y las cantidades sean correctos.</w:t>
       </w:r>
@@ -3671,12 +3747,7 @@
         <w:rPr>
           <w:lang w:val="es-ES"/>
         </w:rPr>
-        <w:t>4.</w:t>
-      </w:r>
-      <w:r>
-        <w:rPr>
-          <w:lang w:val="es-ES"/>
-        </w:rPr>
+        <w:t>5.</w:t>
         <w:tab/>
         <w:t>Seleccione Guardar venta una sola vez y espere el mensaje de resultado. Si la cantidad supera el stock disponible, corrija la cantidad o revise las existencias antes de volver a guardar.</w:t>
       </w:r>
@@ -3692,20 +3763,20 @@
         <w:rPr>
           <w:lang w:val="es-ES"/>
         </w:rPr>
-        <w:t>Al guardar, el aplicativo asigna el ID y la fecha de la factura, registra el estado Pagado y descuenta las cantidades del inventario. El formulario no procesa pagos ni confirma una transacción bancaria: Pagado es el estado que registra el flujo de venta de esta versión. La venta y sus detalles no pueden editarse ni eliminarse desde la interfaz (Equipo del proyecto, 2026a, 2026b, 2026c).</w:t>
-      </w:r>
-    </w:p>
-    <w:p>
-      <w:pPr>
-        <w:rPr>
-          <w:lang w:val="es-ES"/>
-        </w:rPr>
-      </w:pPr>
-      <w:r>
-        <w:rPr>
-          <w:lang w:val="es-ES"/>
-        </w:rPr>
-        <w:t>El total estimado y los comprobantes usan el precio vigente del catálogo. Si el precio de un producto cambia más adelante, el total presentado para una factura anterior también puede cambiar; el sistema no conserva el precio histórico de la venta.</w:t>
+        <w:t xml:space="preserve">Al guardar, el aplicativo asigna el ID y la fecha de la factura, registra el estado elegido (Pagado o Pendiente), guarda el precio de cada producto y descuenta las cantidades del inventario. El formulario no procesa pagos ni confirma transacciones bancarias. La venta y sus detalles no pueden editarse ni eliminarse desde la interfaz (Equipo del proyecto, 2026a, 2026c).</w:t>
+      </w:r>
+    </w:p>
+    <w:p>
+      <w:pPr>
+        <w:rPr>
+          <w:lang w:val="es-ES"/>
+        </w:rPr>
+      </w:pPr>
+      <w:r>
+        <w:rPr>
+          <w:lang w:val="es-ES"/>
+        </w:rPr>
+        <w:t xml:space="preserve">El total estimado usa el precio actual del catálogo, y ese mismo precio queda guardado en la factura. Si el precio de un producto cambia más adelante, las facturas anteriores conservan su total; solo las ventas nuevas usan el precio nuevo.</w:t>
       </w:r>
     </w:p>
     <w:p>
@@ -3723,7 +3794,7 @@
           <w:lang w:val="es-ES"/>
         </w:rPr>
         <w:lastRenderedPageBreak/>
-        <w:t>Figura 7</w:t>
+        <w:t>Figura 8</w:t>
       </w:r>
     </w:p>
     <w:p>
@@ -3741,16 +3812,9 @@
           <w:lang w:val="es-ES"/>
         </w:rPr>
         <w:t>Registro de una venta</w:t>
-      </w:r>
-      <w:r>
-        <w:rPr>
-          <w:rFonts w:eastAsia="Arial" w:cs="Arial"/>
-          <w:i/>
-          <w:lang w:val="es-ES"/>
-        </w:rPr>
         <w:drawing>
           <wp:inline distT="0" distB="0" distL="0" distR="0" wp14:anchorId="195A35FC" wp14:editId="18D3FA15">
-            <wp:extent cx="5943600" cy="3831590"/>
+            <wp:extent cx="5943600" cy="4106414"/>
             <wp:effectExtent l="0" t="0" r="0" b="0"/>
             <wp:docPr id="1707175848" name="Imagen 1"/>
             <wp:cNvGraphicFramePr>
@@ -3772,7 +3836,7 @@
                   <pic:spPr>
                     <a:xfrm>
                       <a:off x="0" y="0"/>
-                      <a:ext cx="5943600" cy="3831590"/>
+                      <a:ext cx="5943600" cy="4106414"/>
                     </a:xfrm>
                     <a:prstGeom prst="rect">
                       <a:avLst/>
@@ -3809,20 +3873,20 @@
         <w:rPr>
           <w:lang w:val="es-ES"/>
         </w:rPr>
-        <w:t>Abra Facturas para consultar las ventas registradas. Puede buscar por ID de factura, ID de cliente o nombre y combinar la búsqueda con una fecha. Seleccione Buscar; use Limpiar para quitar todos los criterios. La lista muestra ID, fecha, cliente, estado, líneas y total vigente.</w:t>
-      </w:r>
-    </w:p>
-    <w:p>
-      <w:pPr>
-        <w:rPr>
-          <w:lang w:val="es-ES"/>
-        </w:rPr>
-      </w:pPr>
-      <w:r>
-        <w:rPr>
-          <w:lang w:val="es-ES"/>
-        </w:rPr>
-        <w:t>Seleccione Ver / imprimir en la factura deseada para abrir el comprobante. Revise el cliente, la fecha, el estado y el detalle. Use Imprimir o Imprimir comprobante para abrir el diálogo del navegador; allí puede escoger una impresora o guardar una copia como PDF, según las opciones disponibles en el equipo.</w:t>
+        <w:t xml:space="preserve">Abra Facturas para consultar las ventas registradas. Puede buscar por ID de factura, ID de cliente o nombre y combinar la búsqueda con una fecha. Seleccione Buscar; use Limpiar para quitar todos los criterios. La lista muestra ID, fecha, cliente, estado, líneas y total.</w:t>
+      </w:r>
+    </w:p>
+    <w:p>
+      <w:pPr>
+        <w:rPr>
+          <w:lang w:val="es-ES"/>
+        </w:rPr>
+      </w:pPr>
+      <w:r>
+        <w:rPr>
+          <w:lang w:val="es-ES"/>
+        </w:rPr>
+        <w:t xml:space="preserve">Seleccione Ver / imprimir en la factura deseada para abrir el comprobante. Revise el cliente, la fecha, el estado y el detalle, que muestra el precio con el que se registró cada producto. Use Imprimir o Imprimir comprobante para abrir el diálogo del navegador; allí puede escoger una impresora o guardar una copia como PDF, según las opciones disponibles en el equipo.</w:t>
       </w:r>
     </w:p>
     <w:p>
@@ -3853,7 +3917,7 @@
           <w:b/>
           <w:lang w:val="es-ES"/>
         </w:rPr>
-        <w:t>Figura 8</w:t>
+        <w:t>Figura 9</w:t>
       </w:r>
     </w:p>
     <w:p>
@@ -3871,16 +3935,9 @@
           <w:lang w:val="es-ES"/>
         </w:rPr>
         <w:t>Consulta e impresión de factura</w:t>
-      </w:r>
-      <w:r>
-        <w:rPr>
-          <w:rFonts w:eastAsia="Arial" w:cs="Arial"/>
-          <w:i/>
-          <w:lang w:val="es-ES"/>
-        </w:rPr>
         <w:drawing>
           <wp:inline distT="0" distB="0" distL="0" distR="0" wp14:anchorId="07FC09C3" wp14:editId="4F797186">
-            <wp:extent cx="5943600" cy="3818890"/>
+            <wp:extent cx="5943600" cy="3823770"/>
             <wp:effectExtent l="0" t="0" r="0" b="0"/>
             <wp:docPr id="1597238188" name="Imagen 1"/>
             <wp:cNvGraphicFramePr>
@@ -3902,7 +3959,7 @@
                   <pic:spPr>
                     <a:xfrm>
                       <a:off x="0" y="0"/>
-                      <a:ext cx="5943600" cy="3818890"/>
+                      <a:ext cx="5943600" cy="3823770"/>
                     </a:xfrm>
                     <a:prstGeom prst="rect">
                       <a:avLst/>
@@ -3940,7 +3997,7 @@
         <w:rPr>
           <w:lang w:val="es-ES"/>
         </w:rPr>
-        <w:t>La cancelación está disponible únicamente para facturas en estado Pagado. Abra la factura desde el listado, seleccione Cancelar factura y confirme la acción cuando el navegador lo solicite. El sistema cambia el estado a Cancelado y repone las cantidades de los productos. Una factura cancelada no puede cancelarse de nuevo ni volver a Pagado desde la interfaz.</w:t>
+        <w:t xml:space="preserve">La cancelación está disponible para facturas en estado Pagado o Pendiente. Abra la factura desde el listado, seleccione Cancelar factura y confirme la acción cuando el navegador lo solicite. El sistema cambia el estado a Cancelado y repone las cantidades de los productos. Una factura cancelada no puede cancelarse de nuevo ni cambiar a otro estado desde la interfaz.</w:t>
       </w:r>
     </w:p>
     <w:p>
@@ -3972,7 +4029,7 @@
           <w:lang w:val="es-ES"/>
         </w:rPr>
         <w:lastRenderedPageBreak/>
-        <w:t>Figura 9</w:t>
+        <w:t>Figura 10</w:t>
       </w:r>
     </w:p>
     <w:p>
@@ -3990,16 +4047,9 @@
           <w:lang w:val="es-ES"/>
         </w:rPr>
         <w:t>Cancelación de factura</w:t>
-      </w:r>
-      <w:r>
-        <w:rPr>
-          <w:rFonts w:eastAsia="Arial" w:cs="Arial"/>
-          <w:i/>
-          <w:lang w:val="es-ES"/>
-        </w:rPr>
         <w:drawing>
           <wp:inline distT="0" distB="0" distL="0" distR="0" wp14:anchorId="5D0B5AB1" wp14:editId="70294D0F">
-            <wp:extent cx="5943600" cy="3752850"/>
+            <wp:extent cx="5943600" cy="3823770"/>
             <wp:effectExtent l="0" t="0" r="0" b="0"/>
             <wp:docPr id="210055009" name="Imagen 1"/>
             <wp:cNvGraphicFramePr>
@@ -4021,7 +4071,7 @@
                   <pic:spPr>
                     <a:xfrm>
                       <a:off x="0" y="0"/>
-                      <a:ext cx="5943600" cy="3752850"/>
+                      <a:ext cx="5943600" cy="3823770"/>
                     </a:xfrm>
                     <a:prstGeom prst="rect">
                       <a:avLst/>
@@ -4032,16 +4082,9 @@
             </a:graphic>
           </wp:inline>
         </w:drawing>
-      </w:r>
-      <w:r>
-        <w:rPr>
-          <w:rFonts w:eastAsia="Arial" w:cs="Arial"/>
-          <w:i/>
-          <w:lang w:val="es-ES"/>
-        </w:rPr>
         <w:drawing>
           <wp:inline distT="0" distB="0" distL="0" distR="0" wp14:anchorId="02A04064" wp14:editId="62279FCC">
-            <wp:extent cx="5943600" cy="3813175"/>
+            <wp:extent cx="5943600" cy="3823770"/>
             <wp:effectExtent l="0" t="0" r="0" b="0"/>
             <wp:docPr id="2011709774" name="Imagen 1"/>
             <wp:cNvGraphicFramePr>
@@ -4063,7 +4106,7 @@
                   <pic:spPr>
                     <a:xfrm>
                       <a:off x="0" y="0"/>
-                      <a:ext cx="5943600" cy="3813175"/>
+                      <a:ext cx="5943600" cy="3823770"/>
                     </a:xfrm>
                     <a:prstGeom prst="rect">
                       <a:avLst/>
@@ -4078,6 +4121,154 @@
     </w:p>
     <w:p>
       <w:pPr>
+        <w:pStyle w:val="Ttulo2"/>
+        <w:keepNext/>
+        <w:pageBreakBefore/>
+        <w:rPr>
+          <w:lang w:val="es-ES"/>
+        </w:rPr>
+      </w:pPr>
+      <w:r>
+        <w:rPr>
+          <w:lang w:val="es-ES"/>
+        </w:rPr>
+        <w:t xml:space="preserve">5.4 Registrar el pago de una venta por cobrar</w:t>
+      </w:r>
+    </w:p>
+    <w:p>
+      <w:pPr>
+        <w:keepLines/>
+        <w:rPr>
+          <w:lang w:val="es-ES"/>
+        </w:rPr>
+      </w:pPr>
+      <w:r>
+        <w:rPr>
+          <w:lang w:val="es-ES"/>
+        </w:rPr>
+        <w:t xml:space="preserve">Las ventas registradas Por cobrar quedan en estado Pendiente y aparecen en el reporte Facturas pendientes. Cuando el cliente pague, abra la factura desde el listado o desde ese reporte, seleccione Registrar pago y confirme. La factura pasa a Pagado y aparece el mensaje «Pago registrado. La factura quedó como Pagado.». El inventario no cambia, porque las existencias se descontaron al registrar la venta.</w:t>
+      </w:r>
+    </w:p>
+    <w:p>
+      <w:pPr>
+        <w:keepLines/>
+        <w:rPr>
+          <w:lang w:val="es-ES"/>
+        </w:rPr>
+      </w:pPr>
+      <w:r>
+        <w:rPr>
+          <w:lang w:val="es-ES"/>
+        </w:rPr>
+        <w:t xml:space="preserve">La acción solo aparece en facturas Pendiente. Si el cliente no va a pagar y la mercancía vuelve a la tienda, use Cancelar factura en lugar de Registrar pago.</w:t>
+      </w:r>
+    </w:p>
+    <w:p>
+      <w:pPr>
+        <w:keepNext/>
+        <w:spacing w:before="100" w:line="240" w:lineRule="auto"/>
+        <w:rPr>
+          <w:lang w:val="es-ES"/>
+        </w:rPr>
+      </w:pPr>
+      <w:r>
+        <w:rPr>
+          <w:rFonts w:eastAsia="Arial" w:cs="Arial"/>
+          <w:b/>
+          <w:lang w:val="es-ES"/>
+        </w:rPr>
+        <w:t xml:space="preserve">Figura 11</w:t>
+      </w:r>
+    </w:p>
+    <w:p>
+      <w:pPr>
+        <w:keepNext/>
+        <w:spacing w:line="240" w:lineRule="auto"/>
+        <w:rPr>
+          <w:lang w:val="es-ES"/>
+        </w:rPr>
+      </w:pPr>
+      <w:r>
+        <w:rPr>
+          <w:rFonts w:eastAsia="Arial" w:cs="Arial"/>
+          <w:i/>
+          <w:lang w:val="es-ES"/>
+        </w:rPr>
+        <w:t>Registro del pago de una factura pendiente</w:t>
+        <w:drawing>
+          <wp:inline distT="0" distB="0" distL="0" distR="0" wp14:anchorId="5D0B5AB1" wp14:editId="70294D0F">
+            <wp:extent cx="5943600" cy="3823770"/>
+            <wp:effectExtent l="0" t="0" r="0" b="0"/>
+            <wp:docPr id="2050044063" name="Imagen 1"/>
+            <wp:cNvGraphicFramePr>
+              <a:graphicFrameLocks xmlns:a="http://schemas.openxmlformats.org/drawingml/2006/main" noChangeAspect="1"/>
+            </wp:cNvGraphicFramePr>
+            <a:graphic xmlns:a="http://schemas.openxmlformats.org/drawingml/2006/main">
+              <a:graphicData uri="http://schemas.openxmlformats.org/drawingml/2006/picture">
+                <pic:pic xmlns:pic="http://schemas.openxmlformats.org/drawingml/2006/picture">
+                  <pic:nvPicPr>
+                    <pic:cNvPr id="210055009" name=""/>
+                    <pic:cNvPicPr/>
+                  </pic:nvPicPr>
+                  <pic:blipFill>
+                    <a:blip r:embed="rId38"/>
+                    <a:stretch>
+                      <a:fillRect/>
+                    </a:stretch>
+                  </pic:blipFill>
+                  <pic:spPr>
+                    <a:xfrm>
+                      <a:off x="0" y="0"/>
+                      <a:ext cx="5943600" cy="3823770"/>
+                    </a:xfrm>
+                    <a:prstGeom prst="rect">
+                      <a:avLst/>
+                    </a:prstGeom>
+                  </pic:spPr>
+                </pic:pic>
+              </a:graphicData>
+            </a:graphic>
+          </wp:inline>
+        </w:drawing>
+        <w:drawing>
+          <wp:inline distT="0" distB="0" distL="0" distR="0" wp14:anchorId="5D0B5AB1" wp14:editId="70294D0F">
+            <wp:extent cx="5943600" cy="3823770"/>
+            <wp:effectExtent l="0" t="0" r="0" b="0"/>
+            <wp:docPr id="2050044064" name="Imagen 1"/>
+            <wp:cNvGraphicFramePr>
+              <a:graphicFrameLocks xmlns:a="http://schemas.openxmlformats.org/drawingml/2006/main" noChangeAspect="1"/>
+            </wp:cNvGraphicFramePr>
+            <a:graphic xmlns:a="http://schemas.openxmlformats.org/drawingml/2006/main">
+              <a:graphicData uri="http://schemas.openxmlformats.org/drawingml/2006/picture">
+                <pic:pic xmlns:pic="http://schemas.openxmlformats.org/drawingml/2006/picture">
+                  <pic:nvPicPr>
+                    <pic:cNvPr id="210055009" name=""/>
+                    <pic:cNvPicPr/>
+                  </pic:nvPicPr>
+                  <pic:blipFill>
+                    <a:blip r:embed="rId39"/>
+                    <a:stretch>
+                      <a:fillRect/>
+                    </a:stretch>
+                  </pic:blipFill>
+                  <pic:spPr>
+                    <a:xfrm>
+                      <a:off x="0" y="0"/>
+                      <a:ext cx="5943600" cy="3823770"/>
+                    </a:xfrm>
+                    <a:prstGeom prst="rect">
+                      <a:avLst/>
+                    </a:prstGeom>
+                  </pic:spPr>
+                </pic:pic>
+              </a:graphicData>
+            </a:graphic>
+          </wp:inline>
+        </w:drawing>
+      </w:r>
+    </w:p>
+    <w:p>
+      <w:pPr>
         <w:pStyle w:val="Ttulo1"/>
         <w:rPr>
           <w:lang w:val="es-ES"/>
@@ -4132,7 +4323,7 @@
           <w:b/>
           <w:lang w:val="es-ES"/>
         </w:rPr>
-        <w:t>Figura 10</w:t>
+        <w:t>Figura 12</w:t>
       </w:r>
     </w:p>
     <w:p>
@@ -4150,16 +4341,9 @@
           <w:lang w:val="es-ES"/>
         </w:rPr>
         <w:t>Resumen general de reportes</w:t>
-      </w:r>
-      <w:r>
-        <w:rPr>
-          <w:rFonts w:eastAsia="Arial" w:cs="Arial"/>
-          <w:i/>
-          <w:lang w:val="es-ES"/>
-        </w:rPr>
         <w:drawing>
           <wp:inline distT="0" distB="0" distL="0" distR="0" wp14:anchorId="416E1BE9" wp14:editId="64499F2B">
-            <wp:extent cx="5943600" cy="3794760"/>
+            <wp:extent cx="5943600" cy="3823770"/>
             <wp:effectExtent l="0" t="0" r="0" b="0"/>
             <wp:docPr id="323293722" name="Imagen 1"/>
             <wp:cNvGraphicFramePr>
@@ -4181,7 +4365,7 @@
                   <pic:spPr>
                     <a:xfrm>
                       <a:off x="0" y="0"/>
-                      <a:ext cx="5943600" cy="3794760"/>
+                      <a:ext cx="5943600" cy="3823770"/>
                     </a:xfrm>
                     <a:prstGeom prst="rect">
                       <a:avLst/>
@@ -4236,7 +4420,7 @@
           <w:lang w:val="es-ES"/>
         </w:rPr>
         <w:lastRenderedPageBreak/>
-        <w:t>Figura 11</w:t>
+        <w:t>Figura 13</w:t>
       </w:r>
     </w:p>
     <w:p>
@@ -4254,16 +4438,9 @@
           <w:lang w:val="es-ES"/>
         </w:rPr>
         <w:t>Clientes y cantidad de facturas</w:t>
-      </w:r>
-      <w:r>
-        <w:rPr>
-          <w:rFonts w:eastAsia="Arial" w:cs="Arial"/>
-          <w:i/>
-          <w:lang w:val="es-ES"/>
-        </w:rPr>
         <w:drawing>
           <wp:inline distT="0" distB="0" distL="0" distR="0" wp14:anchorId="08F2F089" wp14:editId="34B998C9">
-            <wp:extent cx="5943600" cy="3843655"/>
+            <wp:extent cx="5943600" cy="3823770"/>
             <wp:effectExtent l="0" t="0" r="0" b="4445"/>
             <wp:docPr id="656109468" name="Imagen 1"/>
             <wp:cNvGraphicFramePr>
@@ -4285,7 +4462,7 @@
                   <pic:spPr>
                     <a:xfrm>
                       <a:off x="0" y="0"/>
-                      <a:ext cx="5943600" cy="3843655"/>
+                      <a:ext cx="5943600" cy="3823770"/>
                     </a:xfrm>
                     <a:prstGeom prst="rect">
                       <a:avLst/>
@@ -4309,20 +4486,20 @@
         <w:rPr>
           <w:lang w:val="es-ES"/>
         </w:rPr>
-        <w:t>6.3 Total vigente por factura</w:t>
-      </w:r>
-    </w:p>
-    <w:p>
-      <w:pPr>
-        <w:rPr>
-          <w:lang w:val="es-ES"/>
-        </w:rPr>
-      </w:pPr>
-      <w:r>
-        <w:rPr>
-          <w:lang w:val="es-ES"/>
-        </w:rPr>
-        <w:t>Presenta el ID de factura, el cliente y el total calculado. Solo aparecen facturas con al menos un detalle; la consulta no filtra por estado, por lo que puede incluir facturas pagadas, canceladas o pendientes. El total se obtiene multiplicando cada cantidad por el precio unitario actual del producto y sumando los subtotales.</w:t>
+        <w:t xml:space="preserve">6.3 Total por factura</w:t>
+      </w:r>
+    </w:p>
+    <w:p>
+      <w:pPr>
+        <w:rPr>
+          <w:lang w:val="es-ES"/>
+        </w:rPr>
+      </w:pPr>
+      <w:r>
+        <w:rPr>
+          <w:lang w:val="es-ES"/>
+        </w:rPr>
+        <w:t xml:space="preserve">Presenta el ID de factura, el cliente, el estado y el total de cada venta en estado Pagado o Pendiente. Las facturas canceladas no aparecen, ni tampoco las que no tienen detalles. El total se obtiene multiplicando cada cantidad por el precio registrado en la venta y sumando los subtotales.</w:t>
       </w:r>
     </w:p>
     <w:p>
@@ -4340,7 +4517,7 @@
           <w:lang w:val="es-ES"/>
         </w:rPr>
         <w:lastRenderedPageBreak/>
-        <w:t>Figura 12</w:t>
+        <w:t>Figura 14</w:t>
       </w:r>
     </w:p>
     <w:p>
@@ -4357,17 +4534,10 @@
           <w:i/>
           <w:lang w:val="es-ES"/>
         </w:rPr>
-        <w:t>Total vigente por factura</w:t>
-      </w:r>
-      <w:r>
-        <w:rPr>
-          <w:rFonts w:eastAsia="Arial" w:cs="Arial"/>
-          <w:i/>
-          <w:lang w:val="es-ES"/>
-        </w:rPr>
+        <w:t>Total por factura</w:t>
         <w:drawing>
           <wp:inline distT="0" distB="0" distL="0" distR="0" wp14:anchorId="5C0E73F8" wp14:editId="3649955D">
-            <wp:extent cx="5943600" cy="3810000"/>
+            <wp:extent cx="5943600" cy="3823770"/>
             <wp:effectExtent l="0" t="0" r="0" b="0"/>
             <wp:docPr id="99162231" name="Imagen 1"/>
             <wp:cNvGraphicFramePr>
@@ -4389,7 +4559,7 @@
                   <pic:spPr>
                     <a:xfrm>
                       <a:off x="0" y="0"/>
-                      <a:ext cx="5943600" cy="3810000"/>
+                      <a:ext cx="5943600" cy="3823770"/>
                     </a:xfrm>
                     <a:prstGeom prst="rect">
                       <a:avLst/>
@@ -4421,20 +4591,20 @@
         <w:rPr>
           <w:lang w:val="es-ES"/>
         </w:rPr>
-        <w:t>6.4 Unidades facturadas por producto</w:t>
-      </w:r>
-    </w:p>
-    <w:p>
-      <w:pPr>
-        <w:rPr>
-          <w:lang w:val="es-ES"/>
-        </w:rPr>
-      </w:pPr>
-      <w:r>
-        <w:rPr>
-          <w:lang w:val="es-ES"/>
-        </w:rPr>
-        <w:t>Suma las cantidades de los detalles de cada producto que haya sido incluido en alguna factura. Solo se muestran productos con al menos un detalle. La suma incluye los detalles de facturas de todos los estados, incluidas las canceladas y pendientes; no equivale al stock disponible.</w:t>
+        <w:t xml:space="preserve">6.4 Unidades vendidas por producto</w:t>
+      </w:r>
+    </w:p>
+    <w:p>
+      <w:pPr>
+        <w:rPr>
+          <w:lang w:val="es-ES"/>
+        </w:rPr>
+      </w:pPr>
+      <w:r>
+        <w:rPr>
+          <w:lang w:val="es-ES"/>
+        </w:rPr>
+        <w:t xml:space="preserve">Suma las cantidades vendidas de cada producto en facturas Pagado o Pendiente. Las facturas canceladas no cuentan, porque sus unidades ya volvieron al inventario. Solo se muestran productos con al menos una venta vigente; la cifra no equivale al stock disponible.</w:t>
       </w:r>
     </w:p>
     <w:p>
@@ -4452,7 +4622,7 @@
           <w:lang w:val="es-ES"/>
         </w:rPr>
         <w:lastRenderedPageBreak/>
-        <w:t>Figura 13</w:t>
+        <w:t>Figura 15</w:t>
       </w:r>
     </w:p>
     <w:p>
@@ -4469,7 +4639,7 @@
           <w:i/>
           <w:lang w:val="es-ES"/>
         </w:rPr>
-        <w:t>Unidades facturadas por producto</w:t>
+        <w:t xml:space="preserve">Unidades vendidas por producto</w:t>
       </w:r>
     </w:p>
     <w:p>
@@ -4489,7 +4659,7 @@
         </w:rPr>
         <w:drawing>
           <wp:inline distT="0" distB="0" distL="0" distR="0" wp14:anchorId="761705BB" wp14:editId="39E48921">
-            <wp:extent cx="5943600" cy="3810000"/>
+            <wp:extent cx="5943600" cy="3823770"/>
             <wp:effectExtent l="0" t="0" r="0" b="0"/>
             <wp:docPr id="485235530" name="Imagen 1"/>
             <wp:cNvGraphicFramePr>
@@ -4503,7 +4673,7 @@
                     <pic:cNvPicPr/>
                   </pic:nvPicPr>
                   <pic:blipFill>
-                    <a:blip r:embed="rId28"/>
+                    <a:blip r:embed="rId40"/>
                     <a:stretch>
                       <a:fillRect/>
                     </a:stretch>
@@ -4511,7 +4681,7 @@
                   <pic:spPr>
                     <a:xfrm>
                       <a:off x="0" y="0"/>
-                      <a:ext cx="5943600" cy="3810000"/>
+                      <a:ext cx="5943600" cy="3823770"/>
                     </a:xfrm>
                     <a:prstGeom prst="rect">
                       <a:avLst/>
@@ -4548,7 +4718,7 @@
         <w:rPr>
           <w:lang w:val="es-ES"/>
         </w:rPr>
-        <w:t>Muestra, por línea de detalle, la factura, el cliente, el estado, la fecha, el producto, la cantidad, el precio vigente y el subtotal vigente. Incluye todos los estados. El precio y el subtotal reflejan el catálogo actual, no necesariamente el valor que tenía el producto en la fecha de la venta.</w:t>
+        <w:t xml:space="preserve">Muestra, por línea de detalle, la factura, el cliente, el estado, la fecha, el producto, la cantidad, el precio de venta y el subtotal. Incluye todos los estados; revise la columna Estado para distinguir las facturas canceladas. El precio y el subtotal son los registrados en la venta.</w:t>
       </w:r>
     </w:p>
     <w:p>
@@ -4566,7 +4736,7 @@
           <w:lang w:val="es-ES"/>
         </w:rPr>
         <w:lastRenderedPageBreak/>
-        <w:t>Figura 14</w:t>
+        <w:t>Figura 16</w:t>
       </w:r>
     </w:p>
     <w:p>
@@ -4603,7 +4773,7 @@
         </w:rPr>
         <w:drawing>
           <wp:inline distT="0" distB="0" distL="0" distR="0" wp14:anchorId="42A08CB5" wp14:editId="37AF042A">
-            <wp:extent cx="5943600" cy="3811905"/>
+            <wp:extent cx="5943600" cy="3823770"/>
             <wp:effectExtent l="0" t="0" r="0" b="0"/>
             <wp:docPr id="1711252749" name="Imagen 1"/>
             <wp:cNvGraphicFramePr>
@@ -4625,7 +4795,7 @@
                   <pic:spPr>
                     <a:xfrm>
                       <a:off x="0" y="0"/>
-                      <a:ext cx="5943600" cy="3811905"/>
+                      <a:ext cx="5943600" cy="3823770"/>
                     </a:xfrm>
                     <a:prstGeom prst="rect">
                       <a:avLst/>
@@ -4662,7 +4832,7 @@
         <w:rPr>
           <w:lang w:val="es-ES"/>
         </w:rPr>
-        <w:t>Lista todos los productos con su stock y precio vigentes. El orden comienza por las existencias más bajas para facilitar la revisión de artículos que pueden agotarse. El reporte de existencias muestra el inventario actual; no resta cantidades por facturas canceladas, porque la cancelación ya repone stock en el flujo del aplicativo.</w:t>
+        <w:t xml:space="preserve">Lista todos los productos con su stock y su precio actual en el catálogo. El orden comienza por las existencias más bajas para facilitar la revisión de artículos que pueden agotarse. El reporte muestra el inventario actual; no resta cantidades por facturas canceladas, porque la cancelación ya repone stock en el flujo del aplicativo.</w:t>
       </w:r>
     </w:p>
     <w:p>
@@ -4680,7 +4850,7 @@
           <w:lang w:val="es-ES"/>
         </w:rPr>
         <w:lastRenderedPageBreak/>
-        <w:t>Figura 15</w:t>
+        <w:t>Figura 17</w:t>
       </w:r>
     </w:p>
     <w:p>
@@ -4700,16 +4870,9 @@
           <w:lang w:val="es-ES"/>
         </w:rPr>
         <w:t>Existencias de productos</w:t>
-      </w:r>
-      <w:r>
-        <w:rPr>
-          <w:rFonts w:eastAsia="Arial" w:cs="Arial"/>
-          <w:i/>
-          <w:lang w:val="es-ES"/>
-        </w:rPr>
         <w:drawing>
           <wp:inline distT="0" distB="0" distL="0" distR="0" wp14:anchorId="30DA133B" wp14:editId="2D041E5C">
-            <wp:extent cx="5943600" cy="3814445"/>
+            <wp:extent cx="5943600" cy="3823770"/>
             <wp:effectExtent l="0" t="0" r="0" b="0"/>
             <wp:docPr id="1304891318" name="Imagen 1"/>
             <wp:cNvGraphicFramePr>
@@ -4731,7 +4894,7 @@
                   <pic:spPr>
                     <a:xfrm>
                       <a:off x="0" y="0"/>
-                      <a:ext cx="5943600" cy="3814445"/>
+                      <a:ext cx="5943600" cy="3823770"/>
                     </a:xfrm>
                     <a:prstGeom prst="rect">
                       <a:avLst/>
@@ -4786,7 +4949,7 @@
           <w:lang w:val="es-ES"/>
         </w:rPr>
         <w:lastRenderedPageBreak/>
-        <w:t>Figura 16</w:t>
+        <w:t>Figura 18</w:t>
       </w:r>
     </w:p>
     <w:p>
@@ -4804,16 +4967,9 @@
           <w:lang w:val="es-ES"/>
         </w:rPr>
         <w:t>Facturas por estado</w:t>
-      </w:r>
-      <w:r>
-        <w:rPr>
-          <w:rFonts w:eastAsia="Arial" w:cs="Arial"/>
-          <w:i/>
-          <w:lang w:val="es-ES"/>
-        </w:rPr>
         <w:drawing>
           <wp:inline distT="0" distB="0" distL="0" distR="0" wp14:anchorId="2C5D8086" wp14:editId="171423B9">
-            <wp:extent cx="5943600" cy="3803650"/>
+            <wp:extent cx="5943600" cy="3823770"/>
             <wp:effectExtent l="0" t="0" r="0" b="6350"/>
             <wp:docPr id="2050044061" name="Imagen 1"/>
             <wp:cNvGraphicFramePr>
@@ -4835,7 +4991,7 @@
                   <pic:spPr>
                     <a:xfrm>
                       <a:off x="0" y="0"/>
-                      <a:ext cx="5943600" cy="3803650"/>
+                      <a:ext cx="5943600" cy="3823770"/>
                     </a:xfrm>
                     <a:prstGeom prst="rect">
                       <a:avLst/>
@@ -4881,7 +5037,7 @@
         <w:rPr>
           <w:lang w:val="es-ES"/>
         </w:rPr>
-        <w:t>Lista las facturas cuyo estado actual es Pendiente, ordenadas desde la más antigua. La consulta no cambia estados ni inventario. La pantalla de Nueva factura de esta versión registra las ventas nuevas como Pagado; por ello, este reporte solo tendrá filas cuando existan registros con estado Pendiente en los datos del sistema.</w:t>
+        <w:t xml:space="preserve">Lista las ventas por cobrar (estado Pendiente), ordenadas desde la más antigua. Desde la columna Acciones puede abrir cada factura para registrar su pago o cancelarla (5.3 y 5.4). La consulta no cambia estados ni inventario.</w:t>
       </w:r>
     </w:p>
     <w:p>
@@ -4895,7 +5051,7 @@
           <w:b/>
         </w:rPr>
         <w:lastRenderedPageBreak/>
-        <w:t>Figura 17</w:t>
+        <w:t>Figura 19</w:t>
       </w:r>
     </w:p>
     <w:p>
@@ -4909,15 +5065,9 @@
           <w:i/>
         </w:rPr>
         <w:t>Facturas pendientes</w:t>
-      </w:r>
-      <w:r>
-        <w:rPr>
-          <w:rFonts w:eastAsia="Arial" w:cs="Arial"/>
-          <w:i/>
-        </w:rPr>
         <w:drawing>
           <wp:inline distT="0" distB="0" distL="0" distR="0" wp14:anchorId="47309FDD" wp14:editId="56D06180">
-            <wp:extent cx="5943600" cy="3619500"/>
+            <wp:extent cx="5943600" cy="3823770"/>
             <wp:effectExtent l="0" t="0" r="0" b="0"/>
             <wp:docPr id="2024898916" name="Imagen 1"/>
             <wp:cNvGraphicFramePr>
@@ -4939,7 +5089,7 @@
                   <pic:spPr>
                     <a:xfrm>
                       <a:off x="0" y="0"/>
-                      <a:ext cx="5943600" cy="3619500"/>
+                      <a:ext cx="5943600" cy="3823770"/>
                     </a:xfrm>
                     <a:prstGeom prst="rect">
                       <a:avLst/>
@@ -4976,7 +5126,7 @@
         <w:rPr>
           <w:lang w:val="es-ES"/>
         </w:rPr>
-        <w:t>Interprete los importes de facturas y reportes como cálculos con el precio vigente del producto. El esquema no guarda precio unitario ni subtotal histórico por línea. Si el catálogo cambia, las consultas volverán a calcular los importes anteriores con el precio actual (Equipo del proyecto, 2026a, 2026b).</w:t>
+        <w:t xml:space="preserve">Los importes de facturas y reportes se calculan con el precio guardado en cada línea al momento de la venta. Por eso un cambio de precio en el catálogo no modifica los totales de facturas anteriores. Solo el formulario de nueva venta y el reporte de existencias muestran el precio actual del catálogo. En una base actualizada desde una versión anterior del aplicativo, las ventas antiguas conservan el precio que tenía el catálogo al momento de la actualización (Equipo del proyecto, 2026a, 2026b).</w:t>
       </w:r>
     </w:p>
     <w:p>
@@ -5017,7 +5167,7 @@
         <w:rPr>
           <w:lang w:val="es-ES"/>
         </w:rPr>
-        <w:t>Lea el mensaje que aparece junto al formulario. Compruebe que el ID de cliente sea un entero positivo no repetido, que los campos obligatorios no estén vacíos, que la unidad no supere 20 caracteres y que stock, cantidad y precio respeten el formato mostrado. Corrija el campo señalado y vuelva a enviar.</w:t>
+        <w:t xml:space="preserve">Lea el mensaje que aparece junto al formulario. Compruebe que el ID de cliente sea un entero positivo no repetido, que los campos obligatorios no estén vacíos, que la unidad no supere 20 caracteres, que la fecha de registro no sea posterior a hoy y que stock, cantidad y precio respeten el formato mostrado. Corrija el campo señalado y vuelva a enviar.</w:t>
       </w:r>
     </w:p>
     <w:p>
@@ -5060,7 +5210,7 @@
         <w:rPr>
           <w:lang w:val="es-ES"/>
         </w:rPr>
-        <w:t>7.3 No se puede guardar o cancelar una venta</w:t>
+        <w:t xml:space="preserve">7.3 No se puede guardar, cobrar o cancelar una venta</w:t>
       </w:r>
     </w:p>
     <w:p>
@@ -5074,7 +5224,7 @@
         <w:rPr>
           <w:lang w:val="es-ES"/>
         </w:rPr>
-        <w:t>Para una venta rechazada por stock insuficiente, revise la cantidad solicitada y el stock que muestra el formulario. Para cancelar, abra la factura y compruebe que esté en estado Pagado. La acción no está disponible para una factura Pendiente o Cancelado. Si el mensaje persiste, conserve el ID de factura o producto y comuníquelo al responsable técnico.</w:t>
+        <w:t xml:space="preserve">Para una venta rechazada por stock insuficiente, revise la cantidad solicitada y el stock que muestra el formulario. Para cancelar, abra la factura y compruebe que esté en estado Pagado o Pendiente; una factura Cancelado no admite más acciones. Registrar pago solo aparece en facturas Pendiente. Si el mensaje persiste, conserve el ID de factura o producto y comuníquelo al responsable técnico.</w:t>
       </w:r>
     </w:p>
     <w:p>
@@ -5238,13 +5388,13 @@
           <w:b/>
           <w:lang w:val="es-ES"/>
         </w:rPr>
-        <w:t>Precio vigente.</w:t>
-      </w:r>
-      <w:r>
-        <w:rPr>
-          <w:lang w:val="es-ES"/>
-        </w:rPr>
-        <w:t xml:space="preserve"> Precio unitario actualmente guardado en el producto y utilizado para calcular importes mostrados.</w:t>
+        <w:t xml:space="preserve">Precio de venta.</w:t>
+      </w:r>
+      <w:r>
+        <w:rPr>
+          <w:lang w:val="es-ES"/>
+        </w:rPr>
+        <w:t xml:space="preserve"> Precio unitario guardado en cada línea de factura al momento de la venta; se usa para calcular los importes y no cambia si el catálogo se actualiza.</w:t>
       </w:r>
     </w:p>
     <w:p>
@@ -5264,7 +5414,27 @@
         <w:rPr>
           <w:lang w:val="es-ES"/>
         </w:rPr>
-        <w:t xml:space="preserve"> Situación actual de la factura: Pagado, Cancelado o Pendiente.</w:t>
+        <w:t xml:space="preserve"> Situación actual de la factura: Pagado (cobrada), Pendiente (por cobrar) o Cancelado (anulada, con el inventario repuesto).</w:t>
+      </w:r>
+    </w:p>
+    <w:p>
+      <w:pPr>
+        <w:rPr>
+          <w:lang w:val="es-ES"/>
+        </w:rPr>
+      </w:pPr>
+      <w:r>
+        <w:rPr>
+          <w:b/>
+          <w:lang w:val="es-ES"/>
+        </w:rPr>
+        <w:t xml:space="preserve">Venta por cobrar.</w:t>
+      </w:r>
+      <w:r>
+        <w:rPr>
+          <w:lang w:val="es-ES"/>
+        </w:rPr>
+        <w:t xml:space="preserve"> Venta registrada en estado Pendiente: descuenta existencias y queda a la espera de que el operador registre el pago.</w:t>
       </w:r>
     </w:p>
     <w:p>
@@ -5327,7 +5497,7 @@
         <w:rPr>
           <w:lang w:val="es-ES"/>
         </w:rPr>
-        <w:t xml:space="preserve"> (versión 1.4) [Documento de requisitos del proyecto].</w:t>
+        <w:t xml:space="preserve"> (versión 1.5) [Documento de requisitos del proyecto].</w:t>
       </w:r>
     </w:p>
     <w:p>

</xml_diff>